<commit_message>
Enhance Mail Generator app with additional features and templates
- Added support for country names in locative case for improved email personalization.
- Introduced input for additional travel days and a checkbox for excluding them from email content.
- Updated email templates to include dynamic subjects and improved formatting for project details.
- Enhanced document generation logic to accommodate new fields and ensure accurate information is presented.
</commit_message>
<xml_diff>
--- a/templates/lista_rezerwowa_szablon.docx
+++ b/templates/lista_rezerwowa_szablon.docx
@@ -10,6 +10,40 @@
       </w:pPr>
       <w:r>
         <w:rPr>
+          <w:b/>
+          <w:bCs/>
+          <w:color w:val="4EA72E" w:themeColor="accent6"/>
+          <w:lang w:val="pl-PL"/>
+        </w:rPr>
+        <w:t>TEMAT</w:t>
+      </w:r>
+      <w:r>
+        <w:rPr>
+          <w:color w:val="4EA72E" w:themeColor="accent6"/>
+          <w:lang w:val="pl-PL"/>
+        </w:rPr>
+        <w:t>:</w:t>
+      </w:r>
+      <w:r>
+        <w:rPr>
+          <w:lang w:val="pl-PL"/>
+        </w:rPr>
+        <w:t xml:space="preserve"> {{ temat_rezerwowy }} </w:t>
+      </w:r>
+      <w:r>
+        <w:rPr>
+          <w:lang w:val="pl-PL"/>
+        </w:rPr>
+        <w:br/>
+      </w:r>
+      <w:r>
+        <w:rPr>
+          <w:lang w:val="pl-PL"/>
+        </w:rPr>
+        <w:br/>
+      </w:r>
+      <w:r>
+        <w:rPr>
           <w:lang w:val="pl-PL"/>
         </w:rPr>
         <w:t>Cześć!</w:t>
@@ -25,7 +59,31 @@
         <w:rPr>
           <w:lang w:val="pl-PL"/>
         </w:rPr>
-        <w:t>Dziękujemy za zainteresowanie wymianą młodzieży Erasmus+</w:t>
+        <w:t xml:space="preserve">Dziękujemy za zainteresowanie </w:t>
+      </w:r>
+      <w:r>
+        <w:rPr>
+          <w:lang w:val="pl-PL"/>
+        </w:rPr>
+        <w:t xml:space="preserve">{{ </w:t>
+      </w:r>
+      <w:r>
+        <w:rPr>
+          <w:lang w:val="pl-PL"/>
+        </w:rPr>
+        <w:t>typ_projektu</w:t>
+      </w:r>
+      <w:r>
+        <w:rPr>
+          <w:lang w:val="pl-PL"/>
+        </w:rPr>
+        <w:t xml:space="preserve">_2 }} </w:t>
+      </w:r>
+      <w:r>
+        <w:rPr>
+          <w:lang w:val="pl-PL"/>
+        </w:rPr>
+        <w:t>Erasmus+</w:t>
       </w:r>
       <w:r>
         <w:rPr>
@@ -33,13 +91,79 @@
           <w:bCs/>
           <w:lang w:val="pl-PL"/>
         </w:rPr>
-        <w:t xml:space="preserve"> "[NAZWA PROJEKTU]" </w:t>
-      </w:r>
-      <w:r>
-        <w:rPr>
-          <w:lang w:val="pl-PL"/>
-        </w:rPr>
-        <w:t xml:space="preserve">w [KRAJ] ([DATY]) </w:t>
+        <w:t xml:space="preserve"> </w:t>
+      </w:r>
+      <w:r>
+        <w:rPr>
+          <w:b/>
+          <w:bCs/>
+          <w:lang w:val="pl-PL"/>
+        </w:rPr>
+        <w:t>"</w:t>
+      </w:r>
+      <w:r>
+        <w:rPr>
+          <w:b/>
+          <w:bCs/>
+          <w:lang w:val="pl-PL"/>
+        </w:rPr>
+        <w:t>{{ nazwa_projektu }}</w:t>
+      </w:r>
+      <w:r>
+        <w:rPr>
+          <w:b/>
+          <w:bCs/>
+          <w:lang w:val="pl-PL"/>
+        </w:rPr>
+        <w:t>"</w:t>
+      </w:r>
+      <w:r>
+        <w:rPr>
+          <w:b/>
+          <w:bCs/>
+          <w:lang w:val="pl-PL"/>
+        </w:rPr>
+        <w:t xml:space="preserve"> </w:t>
+      </w:r>
+      <w:r>
+        <w:rPr>
+          <w:lang w:val="pl-PL"/>
+        </w:rPr>
+        <w:t xml:space="preserve">w </w:t>
+      </w:r>
+      <w:r>
+        <w:rPr>
+          <w:b/>
+          <w:bCs/>
+          <w:lang w:val="pl-PL"/>
+        </w:rPr>
+        <w:t>{{ kraj_2 }}</w:t>
+      </w:r>
+      <w:r>
+        <w:rPr>
+          <w:lang w:val="pl-PL"/>
+        </w:rPr>
+        <w:t xml:space="preserve"> (</w:t>
+      </w:r>
+      <w:r>
+        <w:rPr>
+          <w:b/>
+          <w:bCs/>
+          <w:lang w:val="pl-PL"/>
+        </w:rPr>
+        <w:t>{{ data_start }} – {{ data_koniec }}</w:t>
+      </w:r>
+      <w:r>
+        <w:rPr>
+          <w:lang w:val="pl-PL"/>
+        </w:rPr>
+        <w:t>)</w:t>
+      </w:r>
+      <w:r>
+        <w:rPr>
+          <w:lang w:val="pl-PL"/>
+        </w:rPr>
+        <w:t xml:space="preserve"> </w:t>
       </w:r>
       <w:r>
         <w:rPr>
@@ -878,6 +1002,7 @@
   <w:style w:type="character" w:default="1" w:styleId="DefaultParagraphFont">
     <w:name w:val="Default Paragraph Font"/>
     <w:uiPriority w:val="1"/>
+    <w:semiHidden/>
     <w:unhideWhenUsed/>
   </w:style>
   <w:style w:type="table" w:default="1" w:styleId="TableNormal">

</xml_diff>

<commit_message>
Update UI text in Mail Generator app for improved user experience
- Changed the title and description of the app to enhance clarity and engagement for users.
</commit_message>
<xml_diff>
--- a/templates/lista_rezerwowa_szablon.docx
+++ b/templates/lista_rezerwowa_szablon.docx
@@ -4,46 +4,68 @@
   <w:body>
     <w:p>
       <w:pPr>
-        <w:rPr>
+        <w:spacing w:after="0"/>
+        <w:rPr>
+          <w:rFonts w:ascii="Arial" w:hAnsi="Arial" w:cs="Arial"/>
+          <w:sz w:val="22"/>
+          <w:szCs w:val="22"/>
           <w:lang w:val="pl-PL"/>
         </w:rPr>
       </w:pPr>
       <w:r>
         <w:rPr>
+          <w:rFonts w:ascii="Arial" w:hAnsi="Arial" w:cs="Arial"/>
           <w:b/>
           <w:bCs/>
           <w:color w:val="4EA72E" w:themeColor="accent6"/>
+          <w:sz w:val="22"/>
+          <w:szCs w:val="22"/>
           <w:lang w:val="pl-PL"/>
         </w:rPr>
         <w:t>TEMAT</w:t>
       </w:r>
       <w:r>
         <w:rPr>
+          <w:rFonts w:ascii="Arial" w:hAnsi="Arial" w:cs="Arial"/>
           <w:color w:val="4EA72E" w:themeColor="accent6"/>
+          <w:sz w:val="22"/>
+          <w:szCs w:val="22"/>
           <w:lang w:val="pl-PL"/>
         </w:rPr>
         <w:t>:</w:t>
       </w:r>
       <w:r>
         <w:rPr>
+          <w:rFonts w:ascii="Arial" w:hAnsi="Arial" w:cs="Arial"/>
+          <w:sz w:val="22"/>
+          <w:szCs w:val="22"/>
           <w:lang w:val="pl-PL"/>
         </w:rPr>
         <w:t xml:space="preserve"> {{ temat_rezerwowy }} </w:t>
       </w:r>
       <w:r>
         <w:rPr>
+          <w:rFonts w:ascii="Arial" w:hAnsi="Arial" w:cs="Arial"/>
+          <w:sz w:val="22"/>
+          <w:szCs w:val="22"/>
           <w:lang w:val="pl-PL"/>
         </w:rPr>
         <w:br/>
       </w:r>
       <w:r>
         <w:rPr>
+          <w:rFonts w:ascii="Arial" w:hAnsi="Arial" w:cs="Arial"/>
+          <w:sz w:val="22"/>
+          <w:szCs w:val="22"/>
           <w:lang w:val="pl-PL"/>
         </w:rPr>
         <w:br/>
       </w:r>
       <w:r>
         <w:rPr>
+          <w:rFonts w:ascii="Arial" w:hAnsi="Arial" w:cs="Arial"/>
+          <w:sz w:val="22"/>
+          <w:szCs w:val="22"/>
           <w:lang w:val="pl-PL"/>
         </w:rPr>
         <w:t>Cześć!</w:t>
@@ -51,123 +73,126 @@
     </w:p>
     <w:p>
       <w:pPr>
-        <w:rPr>
+        <w:spacing w:after="0"/>
+        <w:rPr>
+          <w:rFonts w:ascii="Arial" w:hAnsi="Arial" w:cs="Arial"/>
+          <w:sz w:val="22"/>
+          <w:szCs w:val="22"/>
           <w:lang w:val="pl-PL"/>
         </w:rPr>
       </w:pPr>
       <w:r>
         <w:rPr>
+          <w:rFonts w:ascii="Arial" w:hAnsi="Arial" w:cs="Arial"/>
+          <w:sz w:val="22"/>
+          <w:szCs w:val="22"/>
           <w:lang w:val="pl-PL"/>
         </w:rPr>
         <w:t xml:space="preserve">Dziękujemy za zainteresowanie </w:t>
       </w:r>
       <w:r>
         <w:rPr>
-          <w:lang w:val="pl-PL"/>
-        </w:rPr>
-        <w:t xml:space="preserve">{{ </w:t>
-      </w:r>
-      <w:r>
-        <w:rPr>
-          <w:lang w:val="pl-PL"/>
-        </w:rPr>
-        <w:t>typ_projektu</w:t>
-      </w:r>
-      <w:r>
-        <w:rPr>
-          <w:lang w:val="pl-PL"/>
-        </w:rPr>
-        <w:t xml:space="preserve">_2 }} </w:t>
-      </w:r>
-      <w:r>
-        <w:rPr>
+          <w:rFonts w:ascii="Arial" w:hAnsi="Arial" w:cs="Arial"/>
+          <w:sz w:val="22"/>
+          <w:szCs w:val="22"/>
+          <w:lang w:val="pl-PL"/>
+        </w:rPr>
+        <w:t xml:space="preserve">{{ typ_projektu_2 }} </w:t>
+      </w:r>
+      <w:r>
+        <w:rPr>
+          <w:rFonts w:ascii="Arial" w:hAnsi="Arial" w:cs="Arial"/>
+          <w:sz w:val="22"/>
+          <w:szCs w:val="22"/>
           <w:lang w:val="pl-PL"/>
         </w:rPr>
         <w:t>Erasmus+</w:t>
       </w:r>
       <w:r>
         <w:rPr>
+          <w:rFonts w:ascii="Arial" w:hAnsi="Arial" w:cs="Arial"/>
           <w:b/>
           <w:bCs/>
+          <w:sz w:val="22"/>
+          <w:szCs w:val="22"/>
           <w:lang w:val="pl-PL"/>
         </w:rPr>
         <w:t xml:space="preserve"> </w:t>
       </w:r>
       <w:r>
         <w:rPr>
+          <w:rFonts w:ascii="Arial" w:hAnsi="Arial" w:cs="Arial"/>
           <w:b/>
           <w:bCs/>
-          <w:lang w:val="pl-PL"/>
-        </w:rPr>
-        <w:t>"</w:t>
-      </w:r>
-      <w:r>
-        <w:rPr>
+          <w:sz w:val="22"/>
+          <w:szCs w:val="22"/>
+          <w:lang w:val="pl-PL"/>
+        </w:rPr>
+        <w:t xml:space="preserve">"{{ nazwa_projektu }}" </w:t>
+      </w:r>
+      <w:r>
+        <w:rPr>
+          <w:rFonts w:ascii="Arial" w:hAnsi="Arial" w:cs="Arial"/>
+          <w:sz w:val="22"/>
+          <w:szCs w:val="22"/>
+          <w:lang w:val="pl-PL"/>
+        </w:rPr>
+        <w:t xml:space="preserve">w </w:t>
+      </w:r>
+      <w:r>
+        <w:rPr>
+          <w:rFonts w:ascii="Arial" w:hAnsi="Arial" w:cs="Arial"/>
           <w:b/>
           <w:bCs/>
-          <w:lang w:val="pl-PL"/>
-        </w:rPr>
-        <w:t>{{ nazwa_projektu }}</w:t>
-      </w:r>
-      <w:r>
-        <w:rPr>
+          <w:sz w:val="22"/>
+          <w:szCs w:val="22"/>
+          <w:lang w:val="pl-PL"/>
+        </w:rPr>
+        <w:t>{{ kraj_2 }}</w:t>
+      </w:r>
+      <w:r>
+        <w:rPr>
+          <w:rFonts w:ascii="Arial" w:hAnsi="Arial" w:cs="Arial"/>
+          <w:sz w:val="22"/>
+          <w:szCs w:val="22"/>
+          <w:lang w:val="pl-PL"/>
+        </w:rPr>
+        <w:t xml:space="preserve"> (</w:t>
+      </w:r>
+      <w:r>
+        <w:rPr>
+          <w:rFonts w:ascii="Arial" w:hAnsi="Arial" w:cs="Arial"/>
           <w:b/>
           <w:bCs/>
-          <w:lang w:val="pl-PL"/>
-        </w:rPr>
-        <w:t>"</w:t>
-      </w:r>
-      <w:r>
-        <w:rPr>
-          <w:b/>
-          <w:bCs/>
+          <w:sz w:val="22"/>
+          <w:szCs w:val="22"/>
+          <w:lang w:val="pl-PL"/>
+        </w:rPr>
+        <w:t>{{ data_start }} – {{ data_koniec }}</w:t>
+      </w:r>
+      <w:r>
+        <w:rPr>
+          <w:rFonts w:ascii="Arial" w:hAnsi="Arial" w:cs="Arial"/>
+          <w:sz w:val="22"/>
+          <w:szCs w:val="22"/>
+          <w:lang w:val="pl-PL"/>
+        </w:rPr>
+        <w:t>)</w:t>
+      </w:r>
+      <w:r>
+        <w:rPr>
+          <w:rFonts w:ascii="Arial" w:hAnsi="Arial" w:cs="Arial"/>
+          <w:sz w:val="22"/>
+          <w:szCs w:val="22"/>
           <w:lang w:val="pl-PL"/>
         </w:rPr>
         <w:t xml:space="preserve"> </w:t>
       </w:r>
       <w:r>
         <w:rPr>
-          <w:lang w:val="pl-PL"/>
-        </w:rPr>
-        <w:t xml:space="preserve">w </w:t>
-      </w:r>
-      <w:r>
-        <w:rPr>
-          <w:b/>
-          <w:bCs/>
-          <w:lang w:val="pl-PL"/>
-        </w:rPr>
-        <w:t>{{ kraj_2 }}</w:t>
-      </w:r>
-      <w:r>
-        <w:rPr>
-          <w:lang w:val="pl-PL"/>
-        </w:rPr>
-        <w:t xml:space="preserve"> (</w:t>
-      </w:r>
-      <w:r>
-        <w:rPr>
-          <w:b/>
-          <w:bCs/>
-          <w:lang w:val="pl-PL"/>
-        </w:rPr>
-        <w:t>{{ data_start }} – {{ data_koniec }}</w:t>
-      </w:r>
-      <w:r>
-        <w:rPr>
-          <w:lang w:val="pl-PL"/>
-        </w:rPr>
-        <w:t>)</w:t>
-      </w:r>
-      <w:r>
-        <w:rPr>
-          <w:lang w:val="pl-PL"/>
-        </w:rPr>
-        <w:t xml:space="preserve"> </w:t>
-      </w:r>
-      <w:r>
-        <w:rPr>
           <w:rFonts w:ascii="Segoe UI Emoji" w:hAnsi="Segoe UI Emoji" w:cs="Segoe UI Emoji"/>
+          <w:sz w:val="22"/>
+          <w:szCs w:val="22"/>
           <w:lang w:val="pl-PL"/>
         </w:rPr>
         <w:t>☀</w:t>
@@ -175,33 +200,49 @@
       <w:r>
         <w:rPr>
           <w:rFonts w:ascii="Segoe UI Emoji" w:hAnsi="Segoe UI Emoji" w:cs="Segoe UI Emoji"/>
+          <w:sz w:val="22"/>
+          <w:szCs w:val="22"/>
         </w:rPr>
         <w:t>️</w:t>
       </w:r>
     </w:p>
     <w:p>
       <w:pPr>
-        <w:rPr>
+        <w:spacing w:after="0"/>
+        <w:rPr>
+          <w:rFonts w:ascii="Arial" w:hAnsi="Arial" w:cs="Arial"/>
+          <w:sz w:val="22"/>
+          <w:szCs w:val="22"/>
           <w:lang w:val="pl-PL"/>
         </w:rPr>
       </w:pPr>
     </w:p>
     <w:p>
       <w:pPr>
-        <w:rPr>
+        <w:spacing w:after="0"/>
+        <w:rPr>
+          <w:rFonts w:ascii="Arial" w:hAnsi="Arial" w:cs="Arial"/>
+          <w:sz w:val="22"/>
+          <w:szCs w:val="22"/>
           <w:lang w:val="pl-PL"/>
         </w:rPr>
       </w:pPr>
       <w:r>
         <w:rPr>
+          <w:rFonts w:ascii="Arial" w:hAnsi="Arial" w:cs="Arial"/>
+          <w:sz w:val="22"/>
+          <w:szCs w:val="22"/>
           <w:lang w:val="pl-PL"/>
         </w:rPr>
         <w:t xml:space="preserve">Do udziału w projekcie zgłosiło się wyjątkowo wiele chętnych osób i wybór uczestniczek i uczestników był dla nas niezwykle trudnym zadaniem. </w:t>
       </w:r>
       <w:r>
         <w:rPr>
+          <w:rFonts w:ascii="Arial" w:hAnsi="Arial" w:cs="Arial"/>
           <w:b/>
           <w:bCs/>
+          <w:sz w:val="22"/>
+          <w:szCs w:val="22"/>
           <w:lang w:val="pl-PL"/>
         </w:rPr>
         <w:t>Wpisujemy Cię jednak na listę rezerwową i skontaktujemy się z Tobą natychmiast w przypadku rezygnacji jednej z osób zakwalifikowanych.</w:t>
@@ -209,19 +250,30 @@
     </w:p>
     <w:p>
       <w:pPr>
-        <w:rPr>
+        <w:spacing w:after="0"/>
+        <w:rPr>
+          <w:rFonts w:ascii="Arial" w:hAnsi="Arial" w:cs="Arial"/>
+          <w:sz w:val="22"/>
+          <w:szCs w:val="22"/>
           <w:lang w:val="pl-PL"/>
         </w:rPr>
       </w:pPr>
     </w:p>
     <w:p>
       <w:pPr>
-        <w:rPr>
+        <w:spacing w:after="0"/>
+        <w:rPr>
+          <w:rFonts w:ascii="Arial" w:hAnsi="Arial" w:cs="Arial"/>
+          <w:sz w:val="22"/>
+          <w:szCs w:val="22"/>
           <w:lang w:val="pl-PL"/>
         </w:rPr>
       </w:pPr>
       <w:r>
         <w:rPr>
+          <w:rFonts w:ascii="Arial" w:hAnsi="Arial" w:cs="Arial"/>
+          <w:sz w:val="22"/>
+          <w:szCs w:val="22"/>
           <w:lang w:val="pl-PL"/>
         </w:rPr>
         <w:t>Tymczasem życzymy powodzenia w rozwoju i będziemy szczęśliwi, mogąc w przyszłości widzieć Cię w roli kandydatki/kandydata do udziału w naszych innych projektach.</w:t>
@@ -229,19 +281,30 @@
     </w:p>
     <w:p>
       <w:pPr>
-        <w:rPr>
+        <w:spacing w:after="0"/>
+        <w:rPr>
+          <w:rFonts w:ascii="Arial" w:hAnsi="Arial" w:cs="Arial"/>
+          <w:sz w:val="22"/>
+          <w:szCs w:val="22"/>
           <w:lang w:val="pl-PL"/>
         </w:rPr>
       </w:pPr>
     </w:p>
     <w:p>
       <w:pPr>
-        <w:rPr>
+        <w:spacing w:after="0"/>
+        <w:rPr>
+          <w:rFonts w:ascii="Arial" w:hAnsi="Arial" w:cs="Arial"/>
+          <w:sz w:val="22"/>
+          <w:szCs w:val="22"/>
           <w:lang w:val="pl-PL"/>
         </w:rPr>
       </w:pPr>
       <w:r>
         <w:rPr>
+          <w:rFonts w:ascii="Arial" w:hAnsi="Arial" w:cs="Arial"/>
+          <w:sz w:val="22"/>
+          <w:szCs w:val="22"/>
           <w:lang w:val="pl-PL"/>
         </w:rPr>
         <w:t>Zachęcamy do obserwowania nas w mediach społecznościowych: </w:t>
@@ -249,20 +312,30 @@
     </w:p>
     <w:p>
       <w:pPr>
-        <w:rPr>
+        <w:spacing w:after="0"/>
+        <w:rPr>
+          <w:rFonts w:ascii="Arial" w:hAnsi="Arial" w:cs="Arial"/>
+          <w:sz w:val="22"/>
+          <w:szCs w:val="22"/>
           <w:lang w:val="pl-PL"/>
         </w:rPr>
       </w:pPr>
       <w:r>
         <w:rPr>
+          <w:rFonts w:ascii="Arial" w:hAnsi="Arial" w:cs="Arial"/>
           <w:b/>
           <w:bCs/>
+          <w:sz w:val="22"/>
+          <w:szCs w:val="22"/>
           <w:lang w:val="pl-PL"/>
         </w:rPr>
         <w:t>INSTAGRAM:</w:t>
       </w:r>
       <w:r>
         <w:rPr>
+          <w:rFonts w:ascii="Arial" w:hAnsi="Arial" w:cs="Arial"/>
+          <w:sz w:val="22"/>
+          <w:szCs w:val="22"/>
           <w:lang w:val="pl-PL"/>
         </w:rPr>
         <w:t xml:space="preserve"> </w:t>
@@ -271,6 +344,9 @@
         <w:r>
           <w:rPr>
             <w:rStyle w:val="Hyperlink"/>
+            <w:rFonts w:ascii="Arial" w:hAnsi="Arial" w:cs="Arial"/>
+            <w:sz w:val="22"/>
+            <w:szCs w:val="22"/>
             <w:lang w:val="pl-PL"/>
           </w:rPr>
           <w:t>@yowopoland</w:t>
@@ -279,20 +355,30 @@
     </w:p>
     <w:p>
       <w:pPr>
-        <w:rPr>
+        <w:spacing w:after="0"/>
+        <w:rPr>
+          <w:rFonts w:ascii="Arial" w:hAnsi="Arial" w:cs="Arial"/>
+          <w:sz w:val="22"/>
+          <w:szCs w:val="22"/>
           <w:lang w:val="pl-PL"/>
         </w:rPr>
       </w:pPr>
       <w:r>
         <w:rPr>
+          <w:rFonts w:ascii="Arial" w:hAnsi="Arial" w:cs="Arial"/>
           <w:b/>
           <w:bCs/>
+          <w:sz w:val="22"/>
+          <w:szCs w:val="22"/>
           <w:lang w:val="pl-PL"/>
         </w:rPr>
         <w:t>FACEBOOK:</w:t>
       </w:r>
       <w:r>
         <w:rPr>
+          <w:rFonts w:ascii="Arial" w:hAnsi="Arial" w:cs="Arial"/>
+          <w:sz w:val="22"/>
+          <w:szCs w:val="22"/>
           <w:lang w:val="pl-PL"/>
         </w:rPr>
         <w:t xml:space="preserve"> </w:t>
@@ -301,6 +387,9 @@
         <w:r>
           <w:rPr>
             <w:rStyle w:val="Hyperlink"/>
+            <w:rFonts w:ascii="Arial" w:hAnsi="Arial" w:cs="Arial"/>
+            <w:sz w:val="22"/>
+            <w:szCs w:val="22"/>
             <w:lang w:val="pl-PL"/>
           </w:rPr>
           <w:t>YoWo Poland</w:t>
@@ -309,26 +398,39 @@
     </w:p>
     <w:p>
       <w:pPr>
-        <w:rPr>
+        <w:spacing w:after="0"/>
+        <w:rPr>
+          <w:rFonts w:ascii="Arial" w:hAnsi="Arial" w:cs="Arial"/>
+          <w:sz w:val="22"/>
+          <w:szCs w:val="22"/>
           <w:lang w:val="pl-PL"/>
         </w:rPr>
       </w:pPr>
       <w:r>
         <w:rPr>
+          <w:rFonts w:ascii="Arial" w:hAnsi="Arial" w:cs="Arial"/>
+          <w:sz w:val="22"/>
+          <w:szCs w:val="22"/>
           <w:lang w:val="pl-PL"/>
         </w:rPr>
         <w:t xml:space="preserve">A także do przejrzenia aktualnych projektów na naszej </w:t>
       </w:r>
       <w:r>
         <w:rPr>
+          <w:rFonts w:ascii="Arial" w:hAnsi="Arial" w:cs="Arial"/>
           <w:b/>
           <w:bCs/>
+          <w:sz w:val="22"/>
+          <w:szCs w:val="22"/>
           <w:lang w:val="pl-PL"/>
         </w:rPr>
         <w:t>stronie internetowej</w:t>
       </w:r>
       <w:r>
         <w:rPr>
+          <w:rFonts w:ascii="Arial" w:hAnsi="Arial" w:cs="Arial"/>
+          <w:sz w:val="22"/>
+          <w:szCs w:val="22"/>
           <w:lang w:val="pl-PL"/>
         </w:rPr>
         <w:t xml:space="preserve">: </w:t>
@@ -337,6 +439,9 @@
         <w:r>
           <w:rPr>
             <w:rStyle w:val="Hyperlink"/>
+            <w:rFonts w:ascii="Arial" w:hAnsi="Arial" w:cs="Arial"/>
+            <w:sz w:val="22"/>
+            <w:szCs w:val="22"/>
             <w:lang w:val="pl-PL"/>
           </w:rPr>
           <w:t>www.yowopoland.org</w:t>
@@ -345,19 +450,30 @@
     </w:p>
     <w:p>
       <w:pPr>
-        <w:rPr>
+        <w:spacing w:after="0"/>
+        <w:rPr>
+          <w:rFonts w:ascii="Arial" w:hAnsi="Arial" w:cs="Arial"/>
+          <w:sz w:val="22"/>
+          <w:szCs w:val="22"/>
           <w:lang w:val="pl-PL"/>
         </w:rPr>
       </w:pPr>
     </w:p>
     <w:p>
       <w:pPr>
-        <w:rPr>
+        <w:spacing w:after="0"/>
+        <w:rPr>
+          <w:rFonts w:ascii="Arial" w:hAnsi="Arial" w:cs="Arial"/>
+          <w:sz w:val="22"/>
+          <w:szCs w:val="22"/>
           <w:lang w:val="pl-PL"/>
         </w:rPr>
       </w:pPr>
       <w:r>
         <w:rPr>
+          <w:rFonts w:ascii="Arial" w:hAnsi="Arial" w:cs="Arial"/>
+          <w:sz w:val="22"/>
+          <w:szCs w:val="22"/>
           <w:lang w:val="pl-PL"/>
         </w:rPr>
         <w:t xml:space="preserve">Pozdrawiamy serdecznie </w:t>
@@ -365,18 +481,27 @@
       <w:r>
         <w:rPr>
           <w:rFonts w:ascii="Segoe UI Emoji" w:hAnsi="Segoe UI Emoji" w:cs="Segoe UI Emoji"/>
+          <w:sz w:val="22"/>
+          <w:szCs w:val="22"/>
         </w:rPr>
         <w:t>💛</w:t>
       </w:r>
     </w:p>
     <w:p>
       <w:pPr>
-        <w:rPr>
+        <w:spacing w:after="0"/>
+        <w:rPr>
+          <w:rFonts w:ascii="Arial" w:hAnsi="Arial" w:cs="Arial"/>
+          <w:sz w:val="22"/>
+          <w:szCs w:val="22"/>
           <w:lang w:val="pl-PL"/>
         </w:rPr>
       </w:pPr>
       <w:r>
         <w:rPr>
+          <w:rFonts w:ascii="Arial" w:hAnsi="Arial" w:cs="Arial"/>
+          <w:sz w:val="22"/>
+          <w:szCs w:val="22"/>
           <w:lang w:val="pl-PL"/>
         </w:rPr>
         <w:t>zespół YoWo Poland</w:t>
@@ -384,7 +509,11 @@
     </w:p>
     <w:p>
       <w:pPr>
-        <w:rPr>
+        <w:spacing w:after="0"/>
+        <w:rPr>
+          <w:rFonts w:ascii="Arial" w:hAnsi="Arial" w:cs="Arial"/>
+          <w:sz w:val="22"/>
+          <w:szCs w:val="22"/>
           <w:lang w:val="pl-PL"/>
         </w:rPr>
       </w:pPr>

</xml_diff>